<commit_message>
Record Panda PickCube baseline success
</commit_message>
<xml_diff>
--- a/docs/MIGRATION_CODE_COMPARISON_DEMO_CN.docx
+++ b/docs/MIGRATION_CODE_COMPARISON_DEMO_CN.docx
@@ -434,7 +434,23 @@
                 <w:color w:val="202020"/>
                 <w:sz w:val="18"/>
               </w:rPr>
-              <w:t>未成功：定义为 hard case，32 组 probe 无 grasp</w:t>
+            </w:r>
+            <w:r>
+              <w:rPr>
+                <w:rFonts w:ascii="Microsoft YaHei" w:hAnsi="Microsoft YaHei" w:eastAsia="Microsoft YaHei"/>
+                <w:b w:val="0"/>
+                <w:color w:val="202020"/>
+                <w:sz w:val="19"/>
+              </w:rPr>
+            </w:r>
+            <w:r>
+              <w:rPr>
+                <w:rFonts w:ascii="Microsoft YaHei" w:hAnsi="Microsoft YaHei" w:eastAsia="Microsoft YaHei"/>
+                <w:b w:val="0"/>
+                <w:color w:val="202020"/>
+                <w:sz w:val="18"/>
+              </w:rPr>
+              <w:t>Panda source OK：ret_val=True，40 steps；xArm6 hard case：32 probe 无 grasp</w:t>
             </w:r>
           </w:p>
         </w:tc>
@@ -2951,7 +2967,15 @@
                 <w:color w:val="202020"/>
                 <w:sz w:val="18"/>
               </w:rPr>
-              <w:t>PickCube 定义为 hard case</w:t>
+            </w:r>
+            <w:r>
+              <w:rPr>
+                <w:rFonts w:ascii="Microsoft YaHei" w:hAnsi="Microsoft YaHei" w:eastAsia="Microsoft YaHei"/>
+                <w:b w:val="0"/>
+                <w:color w:val="202020"/>
+                <w:sz w:val="20"/>
+              </w:rPr>
+              <w:t>Panda baseline 成功；xArm6 定义为 hard case</w:t>
             </w:r>
           </w:p>
         </w:tc>
@@ -2972,7 +2996,15 @@
                 <w:color w:val="202020"/>
                 <w:sz w:val="18"/>
               </w:rPr>
-              <w:t>用于展示 LLM 迁移的边界和下一步研究动机</w:t>
+            </w:r>
+            <w:r>
+              <w:rPr>
+                <w:rFonts w:ascii="Microsoft YaHei" w:hAnsi="Microsoft YaHei" w:eastAsia="Microsoft YaHei"/>
+                <w:b w:val="0"/>
+                <w:color w:val="202020"/>
+                <w:sz w:val="20"/>
+              </w:rPr>
+              <w:t>说明源程序有效；hard case 集中在目标端真实抓取迁移</w:t>
             </w:r>
           </w:p>
         </w:tc>
@@ -3015,7 +3047,8 @@
           </w:tcPr>
           <w:p>
             <w:pPr>
-              <w:spacing w:after="60"/>
+              <w:spacing w:after="0"/>
+              <w:jc w:val="left"/>
             </w:pPr>
             <w:r>
               <w:rPr>
@@ -3025,7 +3058,17 @@
                 <w:color w:val="0B2545"/>
                 <w:sz w:val="21"/>
               </w:rPr>
+            </w:r>
+            <w:r>
+              <w:rPr>
+                <w:rFonts w:ascii="Microsoft YaHei" w:hAnsi="Microsoft YaHei" w:eastAsia="Microsoft YaHei"/>
+                <w:b w:val="0"/>
+                <w:color w:val="202020"/>
+                <w:sz w:val="21"/>
+              </w:rPr>
               <w:t>PickCube 的价值</w:t>
+              <w:br/>
+              <w:t>它不是源端失败：Panda baseline 已成功。它提供的是迁移 hard case：LLM 可以生成结构化 adapter 和诊断，但 xArm6 真实抓取需要更强的物理探针、夹爪包络建模或更底层的接触/控制策略。</w:t>
             </w:r>
           </w:p>
           <w:p>
@@ -3040,7 +3083,6 @@
                 <w:color w:val="202020"/>
                 <w:sz w:val="21"/>
               </w:rPr>
-              <w:t>它提供了一个负结果：LLM 可以生成结构化 adapter 和诊断，但真实抓取需要更强的物理探针、夹爪包络建模或更底层的接触/控制策略。</w:t>
             </w:r>
           </w:p>
         </w:tc>
@@ -3323,7 +3365,15 @@
                 <w:color w:val="202020"/>
                 <w:sz w:val="18"/>
               </w:rPr>
-              <w:t>PickCube 的接近可以做到很准，但闭爪后仍不能稳定形成 force-closure grasp。</w:t>
+            </w:r>
+            <w:r>
+              <w:rPr>
+                <w:rFonts w:ascii="Microsoft YaHei" w:hAnsi="Microsoft YaHei" w:eastAsia="Microsoft YaHei"/>
+                <w:b w:val="0"/>
+                <w:color w:val="202020"/>
+                <w:sz w:val="20"/>
+              </w:rPr>
+              <w:t>失败不在源端 Panda：baseline 已成功。失败发生在 xArm6 target adapter 的真实 force-closure grasp。</w:t>
             </w:r>
           </w:p>
         </w:tc>
@@ -3419,7 +3469,8 @@
           </w:tcPr>
           <w:p>
             <w:pPr>
-              <w:spacing w:after="60"/>
+              <w:spacing w:after="0"/>
+              <w:jc w:val="left"/>
             </w:pPr>
             <w:r>
               <w:rPr>
@@ -3429,7 +3480,17 @@
                 <w:color w:val="0B2545"/>
                 <w:sz w:val="21"/>
               </w:rPr>
+            </w:r>
+            <w:r>
+              <w:rPr>
+                <w:rFonts w:ascii="Microsoft YaHei" w:hAnsi="Microsoft YaHei" w:eastAsia="Microsoft YaHei"/>
+                <w:b w:val="0"/>
+                <w:color w:val="202020"/>
+                <w:sz w:val="21"/>
+              </w:rPr>
               <w:t>汇报主线</w:t>
+              <w:br/>
+              <w:t>我现在已经得到一个正结果和一个 hard case：PullCube 证明 LLM 生成 adapter 可以完成真实机器人迁移；PickCube 的 Panda baseline 已成功，但 xArm6 迁移失败，说明真实抓取不能只靠 prompt，需要把失败诊断和物理探针接入自动纠正循环。</w:t>
             </w:r>
           </w:p>
           <w:p>
@@ -3444,7 +3505,6 @@
                 <w:color w:val="202020"/>
                 <w:sz w:val="21"/>
               </w:rPr>
-              <w:t>我现在已经得到一个正结果和一个 hard case：PullCube 证明 LLM 生成 adapter 可以完成真实机器人迁移；PickCube 证明真实抓取不能只靠 prompt，需要把失败诊断和物理探针接入自动纠正循环。</w:t>
             </w:r>
           </w:p>
         </w:tc>

</xml_diff>